<commit_message>
Add multiple keys operation
</commit_message>
<xml_diff>
--- a/Middleware Implementation.docx
+++ b/Middleware Implementation.docx
@@ -5,16 +5,17 @@
     <w:p>
       <w:pPr>
         <w:rPr>
-          <w:b/>
-          <w:bCs/>
+          <w:b w:val="1"/>
+          <w:bCs w:val="1"/>
           <w:sz w:val="28"/>
           <w:szCs w:val="28"/>
         </w:rPr>
       </w:pPr>
-      <w:r>
-        <w:rPr>
-          <w:b/>
-          <w:bCs/>
+      <w:proofErr w:type="spellStart"/>
+      <w:r>
+        <w:rPr>
+          <w:b w:val="1"/>
+          <w:bCs w:val="1"/>
           <w:sz w:val="28"/>
           <w:szCs w:val="28"/>
         </w:rPr>
@@ -22,13 +23,14 @@
       </w:r>
       <w:r>
         <w:rPr>
-          <w:b/>
-          <w:bCs/>
+          <w:b w:val="1"/>
+          <w:bCs w:val="1"/>
           <w:sz w:val="28"/>
           <w:szCs w:val="28"/>
         </w:rPr>
         <w:t xml:space="preserve"> (Database)</w:t>
       </w:r>
+      <w:proofErr w:type="spellEnd"/>
     </w:p>
     <w:p>
       <w:pPr>
@@ -38,17 +40,444 @@
           <w:numId w:val="3"/>
         </w:numPr>
         <w:rPr>
+          <w:b w:val="1"/>
+          <w:bCs w:val="1"/>
+        </w:rPr>
+      </w:pPr>
+      <w:r>
+        <w:rPr/>
+        <w:t>Redis</w:t>
+      </w:r>
+    </w:p>
+    <w:p>
+      <w:pPr>
+        <w:pStyle w:val="Normal"/>
+        <w:ind w:left="0"/>
+        <w:rPr>
+          <w:b w:val="1"/>
+          <w:bCs w:val="1"/>
+        </w:rPr>
+      </w:pPr>
+    </w:p>
+    <w:p>
+      <w:pPr>
+        <w:pStyle w:val="Normal"/>
+        <w:ind w:left="0"/>
+        <w:rPr>
+          <w:b w:val="1"/>
+          <w:bCs w:val="1"/>
+        </w:rPr>
+      </w:pPr>
+      <w:r>
+        <w:rPr>
+          <w:b w:val="1"/>
+          <w:bCs w:val="1"/>
+        </w:rPr>
+        <w:t>Features:</w:t>
+      </w:r>
+    </w:p>
+    <w:p>
+      <w:pPr>
+        <w:pStyle w:val="ListParagraph"/>
+        <w:numPr>
+          <w:ilvl w:val="0"/>
+          <w:numId w:val="8"/>
+        </w:numPr>
+        <w:rPr>
+          <w:b w:val="0"/>
+          <w:bCs w:val="0"/>
+        </w:rPr>
+      </w:pPr>
+      <w:r>
+        <w:rPr>
+          <w:b w:val="0"/>
+          <w:bCs w:val="0"/>
+        </w:rPr>
+        <w:t>In-memory database</w:t>
+      </w:r>
+    </w:p>
+    <w:p>
+      <w:pPr>
+        <w:pStyle w:val="ListParagraph"/>
+        <w:numPr>
+          <w:ilvl w:val="0"/>
+          <w:numId w:val="8"/>
+        </w:numPr>
+        <w:rPr>
+          <w:b w:val="0"/>
+          <w:bCs w:val="0"/>
+        </w:rPr>
+      </w:pPr>
+      <w:r>
+        <w:rPr>
+          <w:b w:val="0"/>
+          <w:bCs w:val="0"/>
+        </w:rPr>
+        <w:t>Single-threaded</w:t>
+      </w:r>
+    </w:p>
+    <w:p>
+      <w:pPr>
+        <w:pStyle w:val="ListParagraph"/>
+        <w:numPr>
+          <w:ilvl w:val="0"/>
+          <w:numId w:val="8"/>
+        </w:numPr>
+        <w:rPr>
+          <w:b w:val="0"/>
+          <w:bCs w:val="0"/>
+        </w:rPr>
+      </w:pPr>
+      <w:r>
+        <w:rPr>
+          <w:b w:val="0"/>
+          <w:bCs w:val="0"/>
+        </w:rPr>
+        <w:t>Asynchronously persistent</w:t>
+      </w:r>
+      <w:r>
+        <w:rPr>
+          <w:b w:val="0"/>
+          <w:bCs w:val="0"/>
+        </w:rPr>
+        <w:t xml:space="preserve"> (using snapshots/using append-only file)</w:t>
+      </w:r>
+    </w:p>
+    <w:p>
+      <w:pPr>
+        <w:pStyle w:val="Normal"/>
+        <w:ind w:left="0"/>
+        <w:rPr>
+          <w:b w:val="1"/>
+          <w:bCs w:val="1"/>
+        </w:rPr>
+      </w:pPr>
+    </w:p>
+    <w:p>
+      <w:pPr>
+        <w:rPr>
           <w:b/>
           <w:bCs/>
         </w:rPr>
       </w:pPr>
-      <w:proofErr w:type="spellStart"/>
-      <w:r>
-        <w:t>FoundationDB</w:t>
-      </w:r>
-      <w:proofErr w:type="spellEnd"/>
-      <w:r>
-        <w:t xml:space="preserve"> (distributed)</w:t>
+      <w:r>
+        <w:rPr>
+          <w:b/>
+          <w:bCs/>
+        </w:rPr>
+        <w:t>Operations:</w:t>
+      </w:r>
+    </w:p>
+    <w:p>
+      <w:pPr>
+        <w:pStyle w:val="ListParagraph"/>
+        <w:numPr>
+          <w:ilvl w:val="0"/>
+          <w:numId w:val="1"/>
+        </w:numPr>
+      </w:pPr>
+      <w:r>
+        <w:t>Single-Key operation</w:t>
+      </w:r>
+      <w:r>
+        <w:t>s</w:t>
+      </w:r>
+      <w:r>
+        <w:t>:</w:t>
+      </w:r>
+    </w:p>
+    <w:p>
+      <w:pPr>
+        <w:pStyle w:val="ListParagraph"/>
+        <w:numPr>
+          <w:ilvl w:val="1"/>
+          <w:numId w:val="1"/>
+        </w:numPr>
+        <w:rPr/>
+      </w:pPr>
+      <w:r>
+        <w:rPr/>
+        <w:t xml:space="preserve">Set </w:t>
+      </w:r>
+      <w:r>
+        <w:rPr/>
+        <w:t>(K)</w:t>
+      </w:r>
+    </w:p>
+    <w:p w14:noSpellErr="1">
+      <w:pPr>
+        <w:pStyle w:val="ListParagraph"/>
+        <w:numPr>
+          <w:ilvl w:val="1"/>
+          <w:numId w:val="1"/>
+        </w:numPr>
+        <w:rPr/>
+      </w:pPr>
+      <w:r>
+        <w:rPr/>
+        <w:t xml:space="preserve">Get </w:t>
+      </w:r>
+      <w:r>
+        <w:rPr/>
+        <w:t>(K)</w:t>
+      </w:r>
+    </w:p>
+    <w:p>
+      <w:pPr>
+        <w:pStyle w:val="ListParagraph"/>
+        <w:numPr>
+          <w:ilvl w:val="1"/>
+          <w:numId w:val="1"/>
+        </w:numPr>
+        <w:rPr/>
+      </w:pPr>
+      <w:r>
+        <w:rPr/>
+        <w:t>Update (K)</w:t>
+      </w:r>
+    </w:p>
+    <w:p>
+      <w:pPr>
+        <w:pStyle w:val="ListParagraph"/>
+        <w:numPr>
+          <w:ilvl w:val="1"/>
+          <w:numId w:val="1"/>
+        </w:numPr>
+        <w:rPr/>
+      </w:pPr>
+      <w:r>
+        <w:rPr/>
+        <w:t>Delete (K)</w:t>
+      </w:r>
+    </w:p>
+    <w:p>
+      <w:pPr>
+        <w:pStyle w:val="ListParagraph"/>
+        <w:numPr>
+          <w:ilvl w:val="0"/>
+          <w:numId w:val="1"/>
+        </w:numPr>
+      </w:pPr>
+      <w:r>
+        <w:t>Multiple-Keys operations:</w:t>
+      </w:r>
+    </w:p>
+    <w:p>
+      <w:pPr>
+        <w:pStyle w:val="ListParagraph"/>
+        <w:numPr>
+          <w:ilvl w:val="1"/>
+          <w:numId w:val="1"/>
+        </w:numPr>
+        <w:rPr/>
+      </w:pPr>
+      <w:r>
+        <w:rPr/>
+        <w:t xml:space="preserve">Set </w:t>
+      </w:r>
+      <w:r>
+        <w:rPr/>
+        <w:t>(K</w:t>
+      </w:r>
+      <w:r>
+        <w:rPr>
+          <w:vertAlign w:val="subscript"/>
+        </w:rPr>
+        <w:t>1</w:t>
+      </w:r>
+      <w:r>
+        <w:rPr/>
+        <w:t>, K</w:t>
+      </w:r>
+      <w:r>
+        <w:rPr>
+          <w:vertAlign w:val="subscript"/>
+        </w:rPr>
+        <w:t>2</w:t>
+      </w:r>
+      <w:r>
+        <w:rPr/>
+        <w:t>, …)</w:t>
+      </w:r>
+    </w:p>
+    <w:p>
+      <w:pPr>
+        <w:pStyle w:val="ListParagraph"/>
+        <w:numPr>
+          <w:ilvl w:val="1"/>
+          <w:numId w:val="1"/>
+        </w:numPr>
+        <w:rPr/>
+      </w:pPr>
+      <w:r>
+        <w:rPr/>
+        <w:t>Get (K</w:t>
+      </w:r>
+      <w:r>
+        <w:rPr>
+          <w:vertAlign w:val="subscript"/>
+        </w:rPr>
+        <w:t>1</w:t>
+      </w:r>
+      <w:r>
+        <w:rPr/>
+        <w:t>, K</w:t>
+      </w:r>
+      <w:r>
+        <w:rPr>
+          <w:vertAlign w:val="subscript"/>
+        </w:rPr>
+        <w:t>2</w:t>
+      </w:r>
+      <w:r>
+        <w:rPr/>
+        <w:t>, …)</w:t>
+      </w:r>
+    </w:p>
+    <w:p>
+      <w:pPr>
+        <w:pStyle w:val="ListParagraph"/>
+        <w:numPr>
+          <w:ilvl w:val="1"/>
+          <w:numId w:val="1"/>
+        </w:numPr>
+        <w:rPr/>
+      </w:pPr>
+      <w:r>
+        <w:rPr/>
+        <w:t>Update (K</w:t>
+      </w:r>
+      <w:r>
+        <w:rPr>
+          <w:vertAlign w:val="subscript"/>
+        </w:rPr>
+        <w:t>1</w:t>
+      </w:r>
+      <w:r>
+        <w:rPr/>
+        <w:t>, K</w:t>
+      </w:r>
+      <w:r>
+        <w:rPr>
+          <w:vertAlign w:val="subscript"/>
+        </w:rPr>
+        <w:t>2</w:t>
+      </w:r>
+      <w:r>
+        <w:rPr/>
+        <w:t>, …)</w:t>
+      </w:r>
+      <w:r>
+        <w:rPr/>
+        <w:t xml:space="preserve"> [TODO afterwards]</w:t>
+      </w:r>
+    </w:p>
+    <w:p>
+      <w:pPr>
+        <w:pStyle w:val="ListParagraph"/>
+        <w:numPr>
+          <w:ilvl w:val="1"/>
+          <w:numId w:val="1"/>
+        </w:numPr>
+        <w:rPr/>
+      </w:pPr>
+      <w:r>
+        <w:rPr/>
+        <w:t>Delete (K</w:t>
+      </w:r>
+      <w:r>
+        <w:rPr>
+          <w:vertAlign w:val="subscript"/>
+        </w:rPr>
+        <w:t>1</w:t>
+      </w:r>
+      <w:r>
+        <w:rPr/>
+        <w:t>, K</w:t>
+      </w:r>
+      <w:r>
+        <w:rPr>
+          <w:vertAlign w:val="subscript"/>
+        </w:rPr>
+        <w:t>2</w:t>
+      </w:r>
+      <w:r>
+        <w:rPr/>
+        <w:t>, …)</w:t>
+      </w:r>
+      <w:r>
+        <w:rPr/>
+        <w:t xml:space="preserve"> [TODO afterwards]</w:t>
+      </w:r>
+    </w:p>
+    <w:p>
+      <w:pPr>
+        <w:pStyle w:val="ListParagraph"/>
+        <w:numPr>
+          <w:ilvl w:val="0"/>
+          <w:numId w:val="1"/>
+        </w:numPr>
+      </w:pPr>
+      <w:r>
+        <w:t>Atomic operations:</w:t>
+      </w:r>
+    </w:p>
+    <w:p>
+      <w:pPr>
+        <w:pStyle w:val="ListParagraph"/>
+        <w:numPr>
+          <w:ilvl w:val="1"/>
+          <w:numId w:val="6"/>
+        </w:numPr>
+        <w:rPr/>
+      </w:pPr>
+      <w:r>
+        <w:rPr/>
+        <w:t>All operations, including multiple keys operations are atomic</w:t>
+      </w:r>
+    </w:p>
+    <w:p w14:noSpellErr="1">
+      <w:pPr>
+        <w:pStyle w:val="Normal"/>
+      </w:pPr>
+    </w:p>
+    <w:p w14:noSpellErr="1">
+      <w:pPr>
+        <w:rPr>
+          <w:b w:val="1"/>
+          <w:bCs w:val="1"/>
+        </w:rPr>
+      </w:pPr>
+      <w:r>
+        <w:rPr>
+          <w:b w:val="1"/>
+          <w:bCs w:val="1"/>
+        </w:rPr>
+        <w:t>Communication:</w:t>
+      </w:r>
+    </w:p>
+    <w:p>
+      <w:pPr>
+        <w:pStyle w:val="ListParagraph"/>
+        <w:numPr>
+          <w:ilvl w:val="0"/>
+          <w:numId w:val="4"/>
+        </w:numPr>
+      </w:pPr>
+      <w:r>
+        <w:t xml:space="preserve">Type: </w:t>
+      </w:r>
+    </w:p>
+    <w:p>
+      <w:pPr>
+        <w:pStyle w:val="ListParagraph"/>
+        <w:numPr>
+          <w:ilvl w:val="0"/>
+          <w:numId w:val="4"/>
+        </w:numPr>
+      </w:pPr>
+      <w:r>
+        <w:t>Client-Middleware:</w:t>
       </w:r>
     </w:p>
     <w:p>
@@ -58,13 +487,15 @@
           <w:ilvl w:val="0"/>
           <w:numId w:val="3"/>
         </w:numPr>
-        <w:rPr>
-          <w:b/>
-          <w:bCs/>
-        </w:rPr>
-      </w:pPr>
-      <w:r>
-        <w:t>Redis</w:t>
+        <w:rPr/>
+      </w:pPr>
+      <w:r>
+        <w:rPr/>
+        <w:t>API call</w:t>
+      </w:r>
+      <w:r>
+        <w:rPr/>
+        <w:t xml:space="preserve"> (via Socket, Inter-process Communication)</w:t>
       </w:r>
     </w:p>
     <w:p>
@@ -74,25 +505,11 @@
           <w:ilvl w:val="0"/>
           <w:numId w:val="3"/>
         </w:numPr>
-        <w:rPr>
-          <w:b/>
-          <w:bCs/>
-        </w:rPr>
-      </w:pPr>
-    </w:p>
-    <w:p>
-      <w:pPr>
-        <w:rPr>
-          <w:b/>
-          <w:bCs/>
-        </w:rPr>
-      </w:pPr>
-      <w:r>
-        <w:rPr>
-          <w:b/>
-          <w:bCs/>
-        </w:rPr>
-        <w:t>Operations:</w:t>
+        <w:rPr/>
+      </w:pPr>
+      <w:r>
+        <w:rPr/>
+        <w:t xml:space="preserve">Redis client: redis-py </w:t>
       </w:r>
     </w:p>
     <w:p>
@@ -100,189 +517,13 @@
         <w:pStyle w:val="ListParagraph"/>
         <w:numPr>
           <w:ilvl w:val="0"/>
-          <w:numId w:val="1"/>
+          <w:numId w:val="3"/>
         </w:numPr>
-      </w:pPr>
-      <w:r>
-        <w:t>Single-Key operation</w:t>
-      </w:r>
-      <w:r>
-        <w:t>s</w:t>
-      </w:r>
-      <w:r>
-        <w:t>:</w:t>
-      </w:r>
-    </w:p>
-    <w:p>
-      <w:pPr>
-        <w:pStyle w:val="ListParagraph"/>
-        <w:numPr>
-          <w:ilvl w:val="1"/>
-          <w:numId w:val="1"/>
-        </w:numPr>
-      </w:pPr>
-      <w:r>
-        <w:t xml:space="preserve">Put </w:t>
-      </w:r>
-      <w:r>
-        <w:t>(K)</w:t>
-      </w:r>
-    </w:p>
-    <w:p>
-      <w:pPr>
-        <w:pStyle w:val="ListParagraph"/>
-        <w:numPr>
-          <w:ilvl w:val="1"/>
-          <w:numId w:val="1"/>
-        </w:numPr>
-      </w:pPr>
-      <w:r>
-        <w:t xml:space="preserve">Get </w:t>
-      </w:r>
-      <w:r>
-        <w:t>(K)</w:t>
-      </w:r>
-    </w:p>
-    <w:p>
-      <w:pPr>
-        <w:pStyle w:val="ListParagraph"/>
-        <w:numPr>
-          <w:ilvl w:val="1"/>
-          <w:numId w:val="1"/>
-        </w:numPr>
-      </w:pPr>
-      <w:r>
-        <w:t>Delete (K)</w:t>
-      </w:r>
-    </w:p>
-    <w:p>
-      <w:pPr>
-        <w:pStyle w:val="ListParagraph"/>
-        <w:numPr>
-          <w:ilvl w:val="0"/>
-          <w:numId w:val="1"/>
-        </w:numPr>
-      </w:pPr>
-      <w:r>
-        <w:t>Multiple-Keys operations:</w:t>
-      </w:r>
-    </w:p>
-    <w:p>
-      <w:pPr>
-        <w:pStyle w:val="ListParagraph"/>
-        <w:numPr>
-          <w:ilvl w:val="1"/>
-          <w:numId w:val="1"/>
-        </w:numPr>
-      </w:pPr>
-      <w:r>
-        <w:t>Put (K</w:t>
-      </w:r>
-      <w:r>
-        <w:rPr>
-          <w:vertAlign w:val="subscript"/>
-        </w:rPr>
-        <w:t>1</w:t>
-      </w:r>
-      <w:r>
-        <w:t>, K</w:t>
-      </w:r>
-      <w:r>
-        <w:rPr>
-          <w:vertAlign w:val="subscript"/>
-        </w:rPr>
-        <w:t>2</w:t>
-      </w:r>
-      <w:r>
-        <w:t>, …)</w:t>
-      </w:r>
-    </w:p>
-    <w:p>
-      <w:pPr>
-        <w:pStyle w:val="ListParagraph"/>
-        <w:numPr>
-          <w:ilvl w:val="1"/>
-          <w:numId w:val="1"/>
-        </w:numPr>
-      </w:pPr>
-      <w:r>
-        <w:t>Get (K</w:t>
-      </w:r>
-      <w:r>
-        <w:rPr>
-          <w:vertAlign w:val="subscript"/>
-        </w:rPr>
-        <w:t>1</w:t>
-      </w:r>
-      <w:r>
-        <w:t>, K</w:t>
-      </w:r>
-      <w:r>
-        <w:rPr>
-          <w:vertAlign w:val="subscript"/>
-        </w:rPr>
-        <w:t>2</w:t>
-      </w:r>
-      <w:r>
-        <w:t>, …)</w:t>
-      </w:r>
-    </w:p>
-    <w:p>
-      <w:pPr>
-        <w:pStyle w:val="ListParagraph"/>
-        <w:numPr>
-          <w:ilvl w:val="1"/>
-          <w:numId w:val="1"/>
-        </w:numPr>
-      </w:pPr>
-      <w:r>
-        <w:t>Delete (K</w:t>
-      </w:r>
-      <w:r>
-        <w:rPr>
-          <w:vertAlign w:val="subscript"/>
-        </w:rPr>
-        <w:t>1</w:t>
-      </w:r>
-      <w:r>
-        <w:t>, K</w:t>
-      </w:r>
-      <w:r>
-        <w:rPr>
-          <w:vertAlign w:val="subscript"/>
-        </w:rPr>
-        <w:t>2</w:t>
-      </w:r>
-      <w:r>
-        <w:t>, …)</w:t>
-      </w:r>
-    </w:p>
-    <w:p>
-      <w:pPr>
-        <w:pStyle w:val="ListParagraph"/>
-        <w:numPr>
-          <w:ilvl w:val="0"/>
-          <w:numId w:val="1"/>
-        </w:numPr>
-      </w:pPr>
-      <w:r>
-        <w:t>Atomic operations:</w:t>
-      </w:r>
-    </w:p>
-    <w:p>
-      <w:pPr>
-        <w:pStyle w:val="ListParagraph"/>
-        <w:numPr>
-          <w:ilvl w:val="1"/>
-          <w:numId w:val="1"/>
-        </w:numPr>
-      </w:pPr>
-    </w:p>
-    <w:p/>
-    <w:p/>
-    <w:p>
-      <w:r>
-        <w:t>Communication:</w:t>
+        <w:rPr/>
+      </w:pPr>
+      <w:r>
+        <w:rPr/>
+        <w:t>Redis: Client-Server architecture with request-response model (TCP connection)</w:t>
       </w:r>
     </w:p>
     <w:p>
@@ -294,19 +535,7 @@
         </w:numPr>
       </w:pPr>
       <w:r>
-        <w:t xml:space="preserve">Type: </w:t>
-      </w:r>
-    </w:p>
-    <w:p>
-      <w:pPr>
-        <w:pStyle w:val="ListParagraph"/>
-        <w:numPr>
-          <w:ilvl w:val="0"/>
-          <w:numId w:val="4"/>
-        </w:numPr>
-      </w:pPr>
-      <w:r>
-        <w:t>Client-Middleware:</w:t>
+        <w:t>Middleware-Database:</w:t>
       </w:r>
     </w:p>
     <w:p>
@@ -316,36 +545,49 @@
           <w:ilvl w:val="0"/>
           <w:numId w:val="3"/>
         </w:numPr>
-      </w:pPr>
-      <w:r>
-        <w:t>API call</w:t>
-      </w:r>
-      <w:r>
-        <w:t xml:space="preserve"> (via Socket, Inter-process Communication)</w:t>
-      </w:r>
-    </w:p>
-    <w:p>
+        <w:rPr/>
+      </w:pPr>
+      <w:r>
+        <w:rPr/>
+        <w:t>API call to the database instance</w:t>
+      </w:r>
+    </w:p>
+    <w:p w14:noSpellErr="1">
+      <w:pPr>
+        <w:pStyle w:val="Normal"/>
+        <w:rPr>
+          <w:b w:val="1"/>
+          <w:bCs w:val="1"/>
+        </w:rPr>
+      </w:pPr>
+    </w:p>
+    <w:p w14:noSpellErr="1">
+      <w:pPr>
+        <w:rPr>
+          <w:b w:val="1"/>
+          <w:bCs w:val="1"/>
+        </w:rPr>
+      </w:pPr>
+      <w:r>
+        <w:rPr>
+          <w:b w:val="1"/>
+          <w:bCs w:val="1"/>
+        </w:rPr>
+        <w:t>Sharding Implementation:</w:t>
+      </w:r>
+    </w:p>
+    <w:p w14:noSpellErr="1">
       <w:pPr>
         <w:pStyle w:val="ListParagraph"/>
         <w:numPr>
           <w:ilvl w:val="0"/>
           <w:numId w:val="3"/>
         </w:numPr>
-      </w:pPr>
-      <w:r>
-        <w:t>Redis: Client-Server architecture with request-response model (TCP connection)</w:t>
-      </w:r>
-    </w:p>
-    <w:p>
-      <w:pPr>
-        <w:pStyle w:val="ListParagraph"/>
-        <w:numPr>
-          <w:ilvl w:val="0"/>
-          <w:numId w:val="4"/>
-        </w:numPr>
-      </w:pPr>
-      <w:r>
-        <w:t>Middleware-Database:</w:t>
+        <w:rPr/>
+      </w:pPr>
+      <w:r>
+        <w:rPr/>
+        <w:t>Proxy assisted sharding (Middleware): Clients send request to the middleware that supports Redis protocol, instead of sending requests directly to the right Redis instances.</w:t>
       </w:r>
     </w:p>
     <w:p>
@@ -355,16 +597,68 @@
           <w:ilvl w:val="0"/>
           <w:numId w:val="3"/>
         </w:numPr>
-      </w:pPr>
-      <w:r>
-        <w:t>API call to the database instance</w:t>
-      </w:r>
-    </w:p>
-    <w:p/>
-    <w:p/>
-    <w:p>
-      <w:r>
-        <w:t>Sharding Implementation:</w:t>
+        <w:rPr/>
+      </w:pPr>
+      <w:r>
+        <w:rPr/>
+        <w:t xml:space="preserve">Hash-based </w:t>
+      </w:r>
+      <w:r>
+        <w:rPr/>
+        <w:t>sharding</w:t>
+      </w:r>
+      <w:r>
+        <w:rPr/>
+        <w:t xml:space="preserve"> (Consistent hashing)</w:t>
+      </w:r>
+    </w:p>
+    <w:p>
+      <w:r>
+        <w:br w:type="page"/>
+      </w:r>
+    </w:p>
+    <w:p>
+      <w:pPr>
+        <w:pStyle w:val="Normal"/>
+        <w:ind w:left="0"/>
+      </w:pPr>
+    </w:p>
+    <w:p>
+      <w:pPr>
+        <w:pStyle w:val="Normal"/>
+        <w:ind w:left="0"/>
+      </w:pPr>
+      <w:r>
+        <w:rPr/>
+        <w:t>M</w:t>
+      </w:r>
+      <w:r>
+        <w:rPr>
+          <w:b w:val="1"/>
+          <w:bCs w:val="1"/>
+        </w:rPr>
+        <w:t>etrics for evaluation:</w:t>
+      </w:r>
+      <w:r>
+        <w:rPr>
+          <w:b w:val="1"/>
+          <w:bCs w:val="1"/>
+        </w:rPr>
+        <w:t xml:space="preserve"> (Performance metrics for </w:t>
+      </w:r>
+      <w:r>
+        <w:rPr>
+          <w:b w:val="1"/>
+          <w:bCs w:val="1"/>
+        </w:rPr>
+        <w:t>Redis</w:t>
+      </w:r>
+      <w:r>
+        <w:rPr>
+          <w:b w:val="1"/>
+          <w:bCs w:val="1"/>
+        </w:rPr>
+        <w:t>)</w:t>
       </w:r>
     </w:p>
     <w:p>
@@ -372,25 +666,626 @@
         <w:pStyle w:val="ListParagraph"/>
         <w:numPr>
           <w:ilvl w:val="0"/>
-          <w:numId w:val="3"/>
+          <w:numId w:val="7"/>
         </w:numPr>
-      </w:pPr>
-      <w:r>
-        <w:t>Proxy assisted sharding (Middleware): Clients send request to the middleware that supports Redis protocol, instead of sending requests directly to the right Redis instances.</w:t>
-      </w:r>
+        <w:rPr>
+          <w:rFonts w:ascii="Calibri" w:hAnsi="Calibri" w:eastAsia="Calibri" w:cs="Calibri"/>
+          <w:noProof w:val="0"/>
+          <w:sz w:val="22"/>
+          <w:szCs w:val="22"/>
+          <w:lang w:val="en-US"/>
+        </w:rPr>
+      </w:pPr>
+      <w:r>
+        <w:rPr>
+          <w:rFonts w:ascii="Calibri" w:hAnsi="Calibri" w:eastAsia="Calibri" w:cs="Calibri"/>
+          <w:noProof w:val="0"/>
+          <w:sz w:val="22"/>
+          <w:szCs w:val="22"/>
+          <w:lang w:val="en-US"/>
+        </w:rPr>
+        <w:t xml:space="preserve">Key-space utilization: </w:t>
+      </w:r>
+      <w:r>
+        <w:rPr>
+          <w:rFonts w:ascii="Calibri" w:hAnsi="Calibri" w:eastAsia="Calibri" w:cs="Calibri"/>
+          <w:noProof w:val="0"/>
+          <w:sz w:val="22"/>
+          <w:szCs w:val="22"/>
+          <w:lang w:val="en-US"/>
+        </w:rPr>
+        <w:t xml:space="preserve">hit rate = </w:t>
+      </w:r>
+      <w:proofErr w:type="spellStart"/>
+      <w:r>
+        <w:rPr>
+          <w:rFonts w:ascii="Calibri" w:hAnsi="Calibri" w:eastAsia="Calibri" w:cs="Calibri"/>
+          <w:noProof w:val="0"/>
+          <w:sz w:val="22"/>
+          <w:szCs w:val="22"/>
+          <w:lang w:val="en-US"/>
+        </w:rPr>
+        <w:t>keyspace_hits</w:t>
+      </w:r>
+      <w:proofErr w:type="spellEnd"/>
+      <w:r>
+        <w:rPr>
+          <w:rFonts w:ascii="Calibri" w:hAnsi="Calibri" w:eastAsia="Calibri" w:cs="Calibri"/>
+          <w:noProof w:val="0"/>
+          <w:sz w:val="22"/>
+          <w:szCs w:val="22"/>
+          <w:lang w:val="en-US"/>
+        </w:rPr>
+        <w:t xml:space="preserve"> / (</w:t>
+      </w:r>
+      <w:proofErr w:type="spellStart"/>
+      <w:r>
+        <w:rPr>
+          <w:rFonts w:ascii="Calibri" w:hAnsi="Calibri" w:eastAsia="Calibri" w:cs="Calibri"/>
+          <w:noProof w:val="0"/>
+          <w:sz w:val="22"/>
+          <w:szCs w:val="22"/>
+          <w:lang w:val="en-US"/>
+        </w:rPr>
+        <w:t>keyspace_hits</w:t>
+      </w:r>
+      <w:proofErr w:type="spellEnd"/>
+      <w:r>
+        <w:rPr>
+          <w:rFonts w:ascii="Calibri" w:hAnsi="Calibri" w:eastAsia="Calibri" w:cs="Calibri"/>
+          <w:noProof w:val="0"/>
+          <w:sz w:val="22"/>
+          <w:szCs w:val="22"/>
+          <w:lang w:val="en-US"/>
+        </w:rPr>
+        <w:t xml:space="preserve"> + </w:t>
+      </w:r>
+      <w:proofErr w:type="spellStart"/>
+      <w:r>
+        <w:rPr>
+          <w:rFonts w:ascii="Calibri" w:hAnsi="Calibri" w:eastAsia="Calibri" w:cs="Calibri"/>
+          <w:noProof w:val="0"/>
+          <w:sz w:val="22"/>
+          <w:szCs w:val="22"/>
+          <w:lang w:val="en-US"/>
+        </w:rPr>
+        <w:t>keyspace_misses</w:t>
+      </w:r>
+      <w:proofErr w:type="spellEnd"/>
+      <w:r>
+        <w:rPr>
+          <w:rFonts w:ascii="Calibri" w:hAnsi="Calibri" w:eastAsia="Calibri" w:cs="Calibri"/>
+          <w:noProof w:val="0"/>
+          <w:sz w:val="22"/>
+          <w:szCs w:val="22"/>
+          <w:lang w:val="en-US"/>
+        </w:rPr>
+        <w:t>)</w:t>
+      </w:r>
+    </w:p>
+    <w:p>
+      <w:pPr>
+        <w:pStyle w:val="ListParagraph"/>
+        <w:numPr>
+          <w:ilvl w:val="0"/>
+          <w:numId w:val="7"/>
+        </w:numPr>
+        <w:rPr>
+          <w:rFonts w:ascii="Calibri" w:hAnsi="Calibri" w:eastAsia="Calibri" w:cs="Calibri"/>
+          <w:noProof w:val="0"/>
+          <w:sz w:val="22"/>
+          <w:szCs w:val="22"/>
+          <w:lang w:val="en-US"/>
+        </w:rPr>
+      </w:pPr>
+      <w:r>
+        <w:rPr>
+          <w:rFonts w:ascii="Calibri" w:hAnsi="Calibri" w:eastAsia="Calibri" w:cs="Calibri"/>
+          <w:noProof w:val="0"/>
+          <w:sz w:val="22"/>
+          <w:szCs w:val="22"/>
+          <w:lang w:val="en-US"/>
+        </w:rPr>
+        <w:t xml:space="preserve">Operation performance: time </w:t>
+      </w:r>
+      <w:r>
+        <w:rPr>
+          <w:rFonts w:ascii="Calibri" w:hAnsi="Calibri" w:eastAsia="Calibri" w:cs="Calibri"/>
+          <w:noProof w:val="0"/>
+          <w:sz w:val="22"/>
+          <w:szCs w:val="22"/>
+          <w:lang w:val="en-US"/>
+        </w:rPr>
+        <w:t xml:space="preserve">taken </w:t>
+      </w:r>
+      <w:r>
+        <w:rPr>
+          <w:rFonts w:ascii="Calibri" w:hAnsi="Calibri" w:eastAsia="Calibri" w:cs="Calibri"/>
+          <w:noProof w:val="0"/>
+          <w:sz w:val="22"/>
+          <w:szCs w:val="22"/>
+          <w:lang w:val="en-US"/>
+        </w:rPr>
+        <w:t>to perform</w:t>
+      </w:r>
+      <w:r>
+        <w:rPr>
+          <w:rFonts w:ascii="Calibri" w:hAnsi="Calibri" w:eastAsia="Calibri" w:cs="Calibri"/>
+          <w:noProof w:val="0"/>
+          <w:sz w:val="22"/>
+          <w:szCs w:val="22"/>
+          <w:lang w:val="en-US"/>
+        </w:rPr>
+        <w:t xml:space="preserve"> with respect to magnitude of operations performed</w:t>
+      </w:r>
+      <w:r>
+        <w:rPr>
+          <w:rFonts w:ascii="Calibri" w:hAnsi="Calibri" w:eastAsia="Calibri" w:cs="Calibri"/>
+          <w:noProof w:val="0"/>
+          <w:sz w:val="22"/>
+          <w:szCs w:val="22"/>
+          <w:lang w:val="en-US"/>
+        </w:rPr>
+        <w:t xml:space="preserve"> (throughput), </w:t>
+      </w:r>
+      <w:r>
+        <w:rPr>
+          <w:rFonts w:ascii="Calibri" w:hAnsi="Calibri" w:eastAsia="Calibri" w:cs="Calibri"/>
+          <w:noProof w:val="0"/>
+          <w:sz w:val="22"/>
+          <w:szCs w:val="22"/>
+          <w:lang w:val="en-US"/>
+        </w:rPr>
+        <w:t>i.e.,</w:t>
+      </w:r>
+      <w:r>
+        <w:rPr>
+          <w:rFonts w:ascii="Calibri" w:hAnsi="Calibri" w:eastAsia="Calibri" w:cs="Calibri"/>
+          <w:noProof w:val="0"/>
+          <w:sz w:val="22"/>
+          <w:szCs w:val="22"/>
+          <w:lang w:val="en-US"/>
+        </w:rPr>
+        <w:t xml:space="preserve"> average response time per query</w:t>
+      </w:r>
+    </w:p>
+    <w:p>
+      <w:pPr>
+        <w:pStyle w:val="Normal"/>
+      </w:pPr>
     </w:p>
     <w:sectPr>
-      <w:pgSz w:w="12240" w:h="15840"/>
+      <w:pgSz w:w="12240" w:h="15840" w:orient="portrait"/>
       <w:pgMar w:top="1440" w:right="1440" w:bottom="1440" w:left="1440" w:header="720" w:footer="720" w:gutter="0"/>
       <w:cols w:space="720"/>
       <w:docGrid w:linePitch="360"/>
+      <w:headerReference w:type="default" r:id="R7e804d4c98b64c91"/>
+      <w:footerReference w:type="default" r:id="R8d6685364f814fb8"/>
     </w:sectPr>
   </w:body>
 </w:document>
 </file>
 
+<file path=word/footer.xml><?xml version="1.0" encoding="utf-8"?>
+<w:ftr xmlns:w14="http://schemas.microsoft.com/office/word/2010/wordml" xmlns:w="http://schemas.openxmlformats.org/wordprocessingml/2006/main">
+  <w:tbl>
+    <w:tblPr>
+      <w:tblStyle w:val="TableNormal"/>
+      <w:bidiVisual w:val="0"/>
+      <w:tblW w:w="0" w:type="auto"/>
+      <w:tblLayout w:type="fixed"/>
+      <w:tblLook w:val="06A0" w:firstRow="1" w:lastRow="0" w:firstColumn="1" w:lastColumn="0" w:noHBand="1" w:noVBand="1"/>
+    </w:tblPr>
+    <w:tblGrid>
+      <w:gridCol w:w="3120"/>
+      <w:gridCol w:w="3120"/>
+      <w:gridCol w:w="3120"/>
+    </w:tblGrid>
+    <w:tr>
+      <w:tc>
+        <w:tcPr>
+          <w:tcW w:w="3120" w:type="dxa"/>
+          <w:tcMar/>
+        </w:tcPr>
+        <w:p>
+          <w:pPr>
+            <w:pStyle w:val="Header"/>
+            <w:bidi w:val="0"/>
+            <w:ind w:left="-115"/>
+            <w:jc w:val="left"/>
+          </w:pPr>
+        </w:p>
+      </w:tc>
+      <w:tc>
+        <w:tcPr>
+          <w:tcW w:w="3120" w:type="dxa"/>
+          <w:tcMar/>
+        </w:tcPr>
+        <w:p>
+          <w:pPr>
+            <w:pStyle w:val="Header"/>
+            <w:bidi w:val="0"/>
+            <w:jc w:val="center"/>
+          </w:pPr>
+        </w:p>
+      </w:tc>
+      <w:tc>
+        <w:tcPr>
+          <w:tcW w:w="3120" w:type="dxa"/>
+          <w:tcMar/>
+        </w:tcPr>
+        <w:p>
+          <w:pPr>
+            <w:pStyle w:val="Header"/>
+            <w:bidi w:val="0"/>
+            <w:ind w:right="-115"/>
+            <w:jc w:val="right"/>
+          </w:pPr>
+        </w:p>
+      </w:tc>
+    </w:tr>
+  </w:tbl>
+  <w:p>
+    <w:pPr>
+      <w:pStyle w:val="Footer"/>
+      <w:bidi w:val="0"/>
+    </w:pPr>
+  </w:p>
+</w:ftr>
+</file>
+
+<file path=word/header.xml><?xml version="1.0" encoding="utf-8"?>
+<w:hdr xmlns:w14="http://schemas.microsoft.com/office/word/2010/wordml" xmlns:w="http://schemas.openxmlformats.org/wordprocessingml/2006/main">
+  <w:tbl>
+    <w:tblPr>
+      <w:tblStyle w:val="TableNormal"/>
+      <w:bidiVisual w:val="0"/>
+      <w:tblW w:w="0" w:type="auto"/>
+      <w:tblLayout w:type="fixed"/>
+      <w:tblLook w:val="06A0" w:firstRow="1" w:lastRow="0" w:firstColumn="1" w:lastColumn="0" w:noHBand="1" w:noVBand="1"/>
+    </w:tblPr>
+    <w:tblGrid>
+      <w:gridCol w:w="3120"/>
+      <w:gridCol w:w="3120"/>
+      <w:gridCol w:w="3120"/>
+    </w:tblGrid>
+    <w:tr>
+      <w:tc>
+        <w:tcPr>
+          <w:tcW w:w="3120" w:type="dxa"/>
+          <w:tcMar/>
+        </w:tcPr>
+        <w:p>
+          <w:pPr>
+            <w:pStyle w:val="Header"/>
+            <w:bidi w:val="0"/>
+            <w:ind w:left="-115"/>
+            <w:jc w:val="left"/>
+          </w:pPr>
+        </w:p>
+      </w:tc>
+      <w:tc>
+        <w:tcPr>
+          <w:tcW w:w="3120" w:type="dxa"/>
+          <w:tcMar/>
+        </w:tcPr>
+        <w:p>
+          <w:pPr>
+            <w:pStyle w:val="Header"/>
+            <w:bidi w:val="0"/>
+            <w:jc w:val="center"/>
+          </w:pPr>
+        </w:p>
+      </w:tc>
+      <w:tc>
+        <w:tcPr>
+          <w:tcW w:w="3120" w:type="dxa"/>
+          <w:tcMar/>
+        </w:tcPr>
+        <w:p>
+          <w:pPr>
+            <w:pStyle w:val="Header"/>
+            <w:bidi w:val="0"/>
+            <w:ind w:right="-115"/>
+            <w:jc w:val="right"/>
+          </w:pPr>
+        </w:p>
+      </w:tc>
+    </w:tr>
+  </w:tbl>
+  <w:p>
+    <w:pPr>
+      <w:pStyle w:val="Header"/>
+      <w:bidi w:val="0"/>
+    </w:pPr>
+  </w:p>
+</w:hdr>
+</file>
+
 <file path=word/numbering.xml><?xml version="1.0" encoding="utf-8"?>
 <w:numbering xmlns:wpc="http://schemas.microsoft.com/office/word/2010/wordprocessingCanvas" xmlns:cx="http://schemas.microsoft.com/office/drawing/2014/chartex" xmlns:cx1="http://schemas.microsoft.com/office/drawing/2015/9/8/chartex" xmlns:cx2="http://schemas.microsoft.com/office/drawing/2015/10/21/chartex" xmlns:cx3="http://schemas.microsoft.com/office/drawing/2016/5/9/chartex" xmlns:cx4="http://schemas.microsoft.com/office/drawing/2016/5/10/chartex" xmlns:cx5="http://schemas.microsoft.com/office/drawing/2016/5/11/chartex" xmlns:cx6="http://schemas.microsoft.com/office/drawing/2016/5/12/chartex" xmlns:cx7="http://schemas.microsoft.com/office/drawing/2016/5/13/chartex" xmlns:cx8="http://schemas.microsoft.com/office/drawing/2016/5/14/chartex" xmlns:mc="http://schemas.openxmlformats.org/markup-compatibility/2006" xmlns:aink="http://schemas.microsoft.com/office/drawing/2016/ink" xmlns:am3d="http://schemas.microsoft.com/office/drawing/2017/model3d" xmlns:o="urn:schemas-microsoft-com:office:office" xmlns:oel="http://schemas.microsoft.com/office/2019/extlst" xmlns:r="http://schemas.openxmlformats.org/officeDocument/2006/relationships" xmlns:m="http://schemas.openxmlformats.org/officeDocument/2006/math" xmlns:v="urn:schemas-microsoft-com:vml" xmlns:wp14="http://schemas.microsoft.com/office/word/2010/wordprocessingDrawing" xmlns:wp="http://schemas.openxmlformats.org/drawingml/2006/wordprocessingDrawing" xmlns:w10="urn:schemas-microsoft-com:office:word" xmlns:w="http://schemas.openxmlformats.org/wordprocessingml/2006/main" xmlns:w14="http://schemas.microsoft.com/office/word/2010/wordml" xmlns:w15="http://schemas.microsoft.com/office/word/2012/wordml" xmlns:w16cex="http://schemas.microsoft.com/office/word/2018/wordml/cex" xmlns:w16cid="http://schemas.microsoft.com/office/word/2016/wordml/cid" xmlns:w16="http://schemas.microsoft.com/office/word/2018/wordml" xmlns:w16sdtdh="http://schemas.microsoft.com/office/word/2020/wordml/sdtdatahash" xmlns:w16se="http://schemas.microsoft.com/office/word/2015/wordml/symex" xmlns:wpg="http://schemas.microsoft.com/office/word/2010/wordprocessingGroup" xmlns:wpi="http://schemas.microsoft.com/office/word/2010/wordprocessingInk" xmlns:wne="http://schemas.microsoft.com/office/word/2006/wordml" xmlns:wps="http://schemas.microsoft.com/office/word/2010/wordprocessingShape" mc:Ignorable="w14 w15 w16se w16cid w16 w16cex w16sdtdh wp14">
+  <w:abstractNum xmlns:w="http://schemas.openxmlformats.org/wordprocessingml/2006/main" w:abstractNumId="7">
+    <w:nsid w:val="277f395b"/>
+    <w:multiLevelType xmlns:w="http://schemas.openxmlformats.org/wordprocessingml/2006/main" w:val="hybridMultilevel"/>
+    <w:lvl xmlns:w="http://schemas.openxmlformats.org/wordprocessingml/2006/main" w:ilvl="0">
+      <w:start w:val="1"/>
+      <w:numFmt w:val="decimal"/>
+      <w:lvlText w:val="%1."/>
+      <w:lvlJc w:val="left"/>
+      <w:pPr>
+        <w:ind w:left="720" w:hanging="360"/>
+      </w:pPr>
+    </w:lvl>
+    <w:lvl xmlns:w="http://schemas.openxmlformats.org/wordprocessingml/2006/main" w:ilvl="1">
+      <w:start w:val="1"/>
+      <w:numFmt w:val="lowerLetter"/>
+      <w:lvlText w:val="%2."/>
+      <w:lvlJc w:val="left"/>
+      <w:pPr>
+        <w:ind w:left="1440" w:hanging="360"/>
+      </w:pPr>
+    </w:lvl>
+    <w:lvl xmlns:w="http://schemas.openxmlformats.org/wordprocessingml/2006/main" w:ilvl="2">
+      <w:start w:val="1"/>
+      <w:numFmt w:val="lowerRoman"/>
+      <w:lvlText w:val="%3."/>
+      <w:lvlJc w:val="right"/>
+      <w:pPr>
+        <w:ind w:left="2160" w:hanging="180"/>
+      </w:pPr>
+    </w:lvl>
+    <w:lvl xmlns:w="http://schemas.openxmlformats.org/wordprocessingml/2006/main" w:ilvl="3">
+      <w:start w:val="1"/>
+      <w:numFmt w:val="decimal"/>
+      <w:lvlText w:val="%4."/>
+      <w:lvlJc w:val="left"/>
+      <w:pPr>
+        <w:ind w:left="2880" w:hanging="360"/>
+      </w:pPr>
+    </w:lvl>
+    <w:lvl xmlns:w="http://schemas.openxmlformats.org/wordprocessingml/2006/main" w:ilvl="4">
+      <w:start w:val="1"/>
+      <w:numFmt w:val="lowerLetter"/>
+      <w:lvlText w:val="%5."/>
+      <w:lvlJc w:val="left"/>
+      <w:pPr>
+        <w:ind w:left="3600" w:hanging="360"/>
+      </w:pPr>
+    </w:lvl>
+    <w:lvl xmlns:w="http://schemas.openxmlformats.org/wordprocessingml/2006/main" w:ilvl="5">
+      <w:start w:val="1"/>
+      <w:numFmt w:val="lowerRoman"/>
+      <w:lvlText w:val="%6."/>
+      <w:lvlJc w:val="right"/>
+      <w:pPr>
+        <w:ind w:left="4320" w:hanging="180"/>
+      </w:pPr>
+    </w:lvl>
+    <w:lvl xmlns:w="http://schemas.openxmlformats.org/wordprocessingml/2006/main" w:ilvl="6">
+      <w:start w:val="1"/>
+      <w:numFmt w:val="decimal"/>
+      <w:lvlText w:val="%7."/>
+      <w:lvlJc w:val="left"/>
+      <w:pPr>
+        <w:ind w:left="5040" w:hanging="360"/>
+      </w:pPr>
+    </w:lvl>
+    <w:lvl xmlns:w="http://schemas.openxmlformats.org/wordprocessingml/2006/main" w:ilvl="7">
+      <w:start w:val="1"/>
+      <w:numFmt w:val="lowerLetter"/>
+      <w:lvlText w:val="%8."/>
+      <w:lvlJc w:val="left"/>
+      <w:pPr>
+        <w:ind w:left="5760" w:hanging="360"/>
+      </w:pPr>
+    </w:lvl>
+    <w:lvl xmlns:w="http://schemas.openxmlformats.org/wordprocessingml/2006/main" w:ilvl="8">
+      <w:start w:val="1"/>
+      <w:numFmt w:val="lowerRoman"/>
+      <w:lvlText w:val="%9."/>
+      <w:lvlJc w:val="right"/>
+      <w:pPr>
+        <w:ind w:left="6480" w:hanging="180"/>
+      </w:pPr>
+    </w:lvl>
+  </w:abstractNum>
+  <w:abstractNum xmlns:w="http://schemas.openxmlformats.org/wordprocessingml/2006/main" w:abstractNumId="6">
+    <w:nsid w:val="6bb1a36c"/>
+    <w:multiLevelType xmlns:w="http://schemas.openxmlformats.org/wordprocessingml/2006/main" w:val="hybridMultilevel"/>
+    <w:lvl xmlns:w="http://schemas.openxmlformats.org/wordprocessingml/2006/main" w:ilvl="0">
+      <w:start w:val="1"/>
+      <w:numFmt w:val="decimal"/>
+      <w:lvlText w:val="%1."/>
+      <w:lvlJc w:val="left"/>
+      <w:pPr>
+        <w:ind w:left="720" w:hanging="360"/>
+      </w:pPr>
+    </w:lvl>
+    <w:lvl xmlns:w="http://schemas.openxmlformats.org/wordprocessingml/2006/main" w:ilvl="1">
+      <w:start w:val="1"/>
+      <w:numFmt w:val="lowerLetter"/>
+      <w:lvlText w:val="%2."/>
+      <w:lvlJc w:val="left"/>
+      <w:pPr>
+        <w:ind w:left="1440" w:hanging="360"/>
+      </w:pPr>
+    </w:lvl>
+    <w:lvl xmlns:w="http://schemas.openxmlformats.org/wordprocessingml/2006/main" w:ilvl="2">
+      <w:start w:val="1"/>
+      <w:numFmt w:val="lowerRoman"/>
+      <w:lvlText w:val="%3."/>
+      <w:lvlJc w:val="right"/>
+      <w:pPr>
+        <w:ind w:left="2160" w:hanging="180"/>
+      </w:pPr>
+    </w:lvl>
+    <w:lvl xmlns:w="http://schemas.openxmlformats.org/wordprocessingml/2006/main" w:ilvl="3">
+      <w:start w:val="1"/>
+      <w:numFmt w:val="decimal"/>
+      <w:lvlText w:val="%4."/>
+      <w:lvlJc w:val="left"/>
+      <w:pPr>
+        <w:ind w:left="2880" w:hanging="360"/>
+      </w:pPr>
+    </w:lvl>
+    <w:lvl xmlns:w="http://schemas.openxmlformats.org/wordprocessingml/2006/main" w:ilvl="4">
+      <w:start w:val="1"/>
+      <w:numFmt w:val="lowerLetter"/>
+      <w:lvlText w:val="%5."/>
+      <w:lvlJc w:val="left"/>
+      <w:pPr>
+        <w:ind w:left="3600" w:hanging="360"/>
+      </w:pPr>
+    </w:lvl>
+    <w:lvl xmlns:w="http://schemas.openxmlformats.org/wordprocessingml/2006/main" w:ilvl="5">
+      <w:start w:val="1"/>
+      <w:numFmt w:val="lowerRoman"/>
+      <w:lvlText w:val="%6."/>
+      <w:lvlJc w:val="right"/>
+      <w:pPr>
+        <w:ind w:left="4320" w:hanging="180"/>
+      </w:pPr>
+    </w:lvl>
+    <w:lvl xmlns:w="http://schemas.openxmlformats.org/wordprocessingml/2006/main" w:ilvl="6">
+      <w:start w:val="1"/>
+      <w:numFmt w:val="decimal"/>
+      <w:lvlText w:val="%7."/>
+      <w:lvlJc w:val="left"/>
+      <w:pPr>
+        <w:ind w:left="5040" w:hanging="360"/>
+      </w:pPr>
+    </w:lvl>
+    <w:lvl xmlns:w="http://schemas.openxmlformats.org/wordprocessingml/2006/main" w:ilvl="7">
+      <w:start w:val="1"/>
+      <w:numFmt w:val="lowerLetter"/>
+      <w:lvlText w:val="%8."/>
+      <w:lvlJc w:val="left"/>
+      <w:pPr>
+        <w:ind w:left="5760" w:hanging="360"/>
+      </w:pPr>
+    </w:lvl>
+    <w:lvl xmlns:w="http://schemas.openxmlformats.org/wordprocessingml/2006/main" w:ilvl="8">
+      <w:start w:val="1"/>
+      <w:numFmt w:val="lowerRoman"/>
+      <w:lvlText w:val="%9."/>
+      <w:lvlJc w:val="right"/>
+      <w:pPr>
+        <w:ind w:left="6480" w:hanging="180"/>
+      </w:pPr>
+    </w:lvl>
+  </w:abstractNum>
+  <w:abstractNum xmlns:w="http://schemas.openxmlformats.org/wordprocessingml/2006/main" w:abstractNumId="5">
+    <w:nsid w:val="26eebb22"/>
+    <w:multiLevelType xmlns:w="http://schemas.openxmlformats.org/wordprocessingml/2006/main" w:val="hybridMultilevel"/>
+    <w:lvl xmlns:w="http://schemas.openxmlformats.org/wordprocessingml/2006/main" w:ilvl="0">
+      <w:start w:val="1"/>
+      <w:numFmt w:val="bullet"/>
+      <w:lvlText w:val=""/>
+      <w:lvlJc w:val="left"/>
+      <w:pPr>
+        <w:ind w:left="720" w:hanging="360"/>
+      </w:pPr>
+      <w:rPr>
+        <w:rFonts w:hint="default" w:ascii="Symbol" w:hAnsi="Symbol"/>
+      </w:rPr>
+    </w:lvl>
+    <w:lvl xmlns:w="http://schemas.openxmlformats.org/wordprocessingml/2006/main" w:ilvl="1">
+      <w:start w:val="1"/>
+      <w:numFmt w:val="bullet"/>
+      <w:lvlText w:val=""/>
+      <w:lvlJc w:val="left"/>
+      <w:pPr>
+        <w:ind w:left="1440" w:hanging="360"/>
+      </w:pPr>
+      <w:rPr>
+        <w:rFonts w:hint="default" w:ascii="Symbol" w:hAnsi="Symbol"/>
+      </w:rPr>
+    </w:lvl>
+    <w:lvl xmlns:w="http://schemas.openxmlformats.org/wordprocessingml/2006/main" w:ilvl="2">
+      <w:start w:val="1"/>
+      <w:numFmt w:val="bullet"/>
+      <w:lvlText w:val=""/>
+      <w:lvlJc w:val="left"/>
+      <w:pPr>
+        <w:ind w:left="2160" w:hanging="360"/>
+      </w:pPr>
+      <w:rPr>
+        <w:rFonts w:hint="default" w:ascii="Wingdings" w:hAnsi="Wingdings"/>
+      </w:rPr>
+    </w:lvl>
+    <w:lvl xmlns:w="http://schemas.openxmlformats.org/wordprocessingml/2006/main" w:ilvl="3">
+      <w:start w:val="1"/>
+      <w:numFmt w:val="bullet"/>
+      <w:lvlText w:val=""/>
+      <w:lvlJc w:val="left"/>
+      <w:pPr>
+        <w:ind w:left="2880" w:hanging="360"/>
+      </w:pPr>
+      <w:rPr>
+        <w:rFonts w:hint="default" w:ascii="Symbol" w:hAnsi="Symbol"/>
+      </w:rPr>
+    </w:lvl>
+    <w:lvl xmlns:w="http://schemas.openxmlformats.org/wordprocessingml/2006/main" w:ilvl="4">
+      <w:start w:val="1"/>
+      <w:numFmt w:val="bullet"/>
+      <w:lvlText w:val="o"/>
+      <w:lvlJc w:val="left"/>
+      <w:pPr>
+        <w:ind w:left="3600" w:hanging="360"/>
+      </w:pPr>
+      <w:rPr>
+        <w:rFonts w:hint="default" w:ascii="Courier New" w:hAnsi="Courier New"/>
+      </w:rPr>
+    </w:lvl>
+    <w:lvl xmlns:w="http://schemas.openxmlformats.org/wordprocessingml/2006/main" w:ilvl="5">
+      <w:start w:val="1"/>
+      <w:numFmt w:val="bullet"/>
+      <w:lvlText w:val=""/>
+      <w:lvlJc w:val="left"/>
+      <w:pPr>
+        <w:ind w:left="4320" w:hanging="360"/>
+      </w:pPr>
+      <w:rPr>
+        <w:rFonts w:hint="default" w:ascii="Wingdings" w:hAnsi="Wingdings"/>
+      </w:rPr>
+    </w:lvl>
+    <w:lvl xmlns:w="http://schemas.openxmlformats.org/wordprocessingml/2006/main" w:ilvl="6">
+      <w:start w:val="1"/>
+      <w:numFmt w:val="bullet"/>
+      <w:lvlText w:val=""/>
+      <w:lvlJc w:val="left"/>
+      <w:pPr>
+        <w:ind w:left="5040" w:hanging="360"/>
+      </w:pPr>
+      <w:rPr>
+        <w:rFonts w:hint="default" w:ascii="Symbol" w:hAnsi="Symbol"/>
+      </w:rPr>
+    </w:lvl>
+    <w:lvl xmlns:w="http://schemas.openxmlformats.org/wordprocessingml/2006/main" w:ilvl="7">
+      <w:start w:val="1"/>
+      <w:numFmt w:val="bullet"/>
+      <w:lvlText w:val="o"/>
+      <w:lvlJc w:val="left"/>
+      <w:pPr>
+        <w:ind w:left="5760" w:hanging="360"/>
+      </w:pPr>
+      <w:rPr>
+        <w:rFonts w:hint="default" w:ascii="Courier New" w:hAnsi="Courier New"/>
+      </w:rPr>
+    </w:lvl>
+    <w:lvl xmlns:w="http://schemas.openxmlformats.org/wordprocessingml/2006/main" w:ilvl="8">
+      <w:start w:val="1"/>
+      <w:numFmt w:val="bullet"/>
+      <w:lvlText w:val=""/>
+      <w:lvlJc w:val="left"/>
+      <w:pPr>
+        <w:ind w:left="6480" w:hanging="360"/>
+      </w:pPr>
+      <w:rPr>
+        <w:rFonts w:hint="default" w:ascii="Wingdings" w:hAnsi="Wingdings"/>
+      </w:rPr>
+    </w:lvl>
+  </w:abstractNum>
   <w:abstractNum w:abstractNumId="0" w15:restartNumberingAfterBreak="0">
     <w:nsid w:val="095E1533"/>
     <w:multiLevelType w:val="hybridMultilevel"/>
@@ -403,7 +1298,7 @@
         <w:ind w:left="720" w:hanging="360"/>
       </w:pPr>
       <w:rPr>
-        <w:rFonts w:ascii="Calibri" w:eastAsiaTheme="minorHAnsi" w:hAnsi="Calibri" w:cs="Calibri" w:hint="default"/>
+        <w:rFonts w:hint="default" w:ascii="Calibri" w:hAnsi="Calibri" w:cs="Calibri" w:eastAsiaTheme="minorHAnsi"/>
       </w:rPr>
     </w:lvl>
     <w:lvl w:ilvl="1" w:tplc="04090003" w:tentative="1">
@@ -415,7 +1310,7 @@
         <w:ind w:left="1440" w:hanging="360"/>
       </w:pPr>
       <w:rPr>
-        <w:rFonts w:ascii="Courier New" w:hAnsi="Courier New" w:cs="Courier New" w:hint="default"/>
+        <w:rFonts w:hint="default" w:ascii="Courier New" w:hAnsi="Courier New" w:cs="Courier New"/>
       </w:rPr>
     </w:lvl>
     <w:lvl w:ilvl="2" w:tplc="04090005" w:tentative="1">
@@ -427,7 +1322,7 @@
         <w:ind w:left="2160" w:hanging="360"/>
       </w:pPr>
       <w:rPr>
-        <w:rFonts w:ascii="Wingdings" w:hAnsi="Wingdings" w:hint="default"/>
+        <w:rFonts w:hint="default" w:ascii="Wingdings" w:hAnsi="Wingdings"/>
       </w:rPr>
     </w:lvl>
     <w:lvl w:ilvl="3" w:tplc="04090001" w:tentative="1">
@@ -439,7 +1334,7 @@
         <w:ind w:left="2880" w:hanging="360"/>
       </w:pPr>
       <w:rPr>
-        <w:rFonts w:ascii="Symbol" w:hAnsi="Symbol" w:hint="default"/>
+        <w:rFonts w:hint="default" w:ascii="Symbol" w:hAnsi="Symbol"/>
       </w:rPr>
     </w:lvl>
     <w:lvl w:ilvl="4" w:tplc="04090003" w:tentative="1">
@@ -451,7 +1346,7 @@
         <w:ind w:left="3600" w:hanging="360"/>
       </w:pPr>
       <w:rPr>
-        <w:rFonts w:ascii="Courier New" w:hAnsi="Courier New" w:cs="Courier New" w:hint="default"/>
+        <w:rFonts w:hint="default" w:ascii="Courier New" w:hAnsi="Courier New" w:cs="Courier New"/>
       </w:rPr>
     </w:lvl>
     <w:lvl w:ilvl="5" w:tplc="04090005" w:tentative="1">
@@ -463,7 +1358,7 @@
         <w:ind w:left="4320" w:hanging="360"/>
       </w:pPr>
       <w:rPr>
-        <w:rFonts w:ascii="Wingdings" w:hAnsi="Wingdings" w:hint="default"/>
+        <w:rFonts w:hint="default" w:ascii="Wingdings" w:hAnsi="Wingdings"/>
       </w:rPr>
     </w:lvl>
     <w:lvl w:ilvl="6" w:tplc="04090001" w:tentative="1">
@@ -475,7 +1370,7 @@
         <w:ind w:left="5040" w:hanging="360"/>
       </w:pPr>
       <w:rPr>
-        <w:rFonts w:ascii="Symbol" w:hAnsi="Symbol" w:hint="default"/>
+        <w:rFonts w:hint="default" w:ascii="Symbol" w:hAnsi="Symbol"/>
       </w:rPr>
     </w:lvl>
     <w:lvl w:ilvl="7" w:tplc="04090003" w:tentative="1">
@@ -487,7 +1382,7 @@
         <w:ind w:left="5760" w:hanging="360"/>
       </w:pPr>
       <w:rPr>
-        <w:rFonts w:ascii="Courier New" w:hAnsi="Courier New" w:cs="Courier New" w:hint="default"/>
+        <w:rFonts w:hint="default" w:ascii="Courier New" w:hAnsi="Courier New" w:cs="Courier New"/>
       </w:rPr>
     </w:lvl>
     <w:lvl w:ilvl="8" w:tplc="04090005" w:tentative="1">
@@ -499,7 +1394,7 @@
         <w:ind w:left="6480" w:hanging="360"/>
       </w:pPr>
       <w:rPr>
-        <w:rFonts w:ascii="Wingdings" w:hAnsi="Wingdings" w:hint="default"/>
+        <w:rFonts w:hint="default" w:ascii="Wingdings" w:hAnsi="Wingdings"/>
       </w:rPr>
     </w:lvl>
   </w:abstractNum>
@@ -779,7 +1674,7 @@
         <w:ind w:left="720" w:hanging="360"/>
       </w:pPr>
       <w:rPr>
-        <w:rFonts w:ascii="Calibri" w:eastAsiaTheme="minorHAnsi" w:hAnsi="Calibri" w:cs="Calibri" w:hint="default"/>
+        <w:rFonts w:hint="default" w:ascii="Calibri" w:hAnsi="Calibri" w:cs="Calibri" w:eastAsiaTheme="minorHAnsi"/>
       </w:rPr>
     </w:lvl>
     <w:lvl w:ilvl="1" w:tplc="04090003">
@@ -791,7 +1686,7 @@
         <w:ind w:left="1440" w:hanging="360"/>
       </w:pPr>
       <w:rPr>
-        <w:rFonts w:ascii="Courier New" w:hAnsi="Courier New" w:cs="Courier New" w:hint="default"/>
+        <w:rFonts w:hint="default" w:ascii="Courier New" w:hAnsi="Courier New" w:cs="Courier New"/>
       </w:rPr>
     </w:lvl>
     <w:lvl w:ilvl="2" w:tplc="04090005">
@@ -803,7 +1698,7 @@
         <w:ind w:left="2160" w:hanging="360"/>
       </w:pPr>
       <w:rPr>
-        <w:rFonts w:ascii="Wingdings" w:hAnsi="Wingdings" w:hint="default"/>
+        <w:rFonts w:hint="default" w:ascii="Wingdings" w:hAnsi="Wingdings"/>
       </w:rPr>
     </w:lvl>
     <w:lvl w:ilvl="3" w:tplc="04090001">
@@ -815,7 +1710,7 @@
         <w:ind w:left="2880" w:hanging="360"/>
       </w:pPr>
       <w:rPr>
-        <w:rFonts w:ascii="Symbol" w:hAnsi="Symbol" w:hint="default"/>
+        <w:rFonts w:hint="default" w:ascii="Symbol" w:hAnsi="Symbol"/>
       </w:rPr>
     </w:lvl>
     <w:lvl w:ilvl="4" w:tplc="04090003">
@@ -827,7 +1722,7 @@
         <w:ind w:left="3600" w:hanging="360"/>
       </w:pPr>
       <w:rPr>
-        <w:rFonts w:ascii="Courier New" w:hAnsi="Courier New" w:cs="Courier New" w:hint="default"/>
+        <w:rFonts w:hint="default" w:ascii="Courier New" w:hAnsi="Courier New" w:cs="Courier New"/>
       </w:rPr>
     </w:lvl>
     <w:lvl w:ilvl="5" w:tplc="04090005">
@@ -839,7 +1734,7 @@
         <w:ind w:left="4320" w:hanging="360"/>
       </w:pPr>
       <w:rPr>
-        <w:rFonts w:ascii="Wingdings" w:hAnsi="Wingdings" w:hint="default"/>
+        <w:rFonts w:hint="default" w:ascii="Wingdings" w:hAnsi="Wingdings"/>
       </w:rPr>
     </w:lvl>
     <w:lvl w:ilvl="6" w:tplc="04090001">
@@ -851,7 +1746,7 @@
         <w:ind w:left="5040" w:hanging="360"/>
       </w:pPr>
       <w:rPr>
-        <w:rFonts w:ascii="Symbol" w:hAnsi="Symbol" w:hint="default"/>
+        <w:rFonts w:hint="default" w:ascii="Symbol" w:hAnsi="Symbol"/>
       </w:rPr>
     </w:lvl>
     <w:lvl w:ilvl="7" w:tplc="04090003">
@@ -863,7 +1758,7 @@
         <w:ind w:left="5760" w:hanging="360"/>
       </w:pPr>
       <w:rPr>
-        <w:rFonts w:ascii="Courier New" w:hAnsi="Courier New" w:cs="Courier New" w:hint="default"/>
+        <w:rFonts w:hint="default" w:ascii="Courier New" w:hAnsi="Courier New" w:cs="Courier New"/>
       </w:rPr>
     </w:lvl>
     <w:lvl w:ilvl="8" w:tplc="04090005">
@@ -875,10 +1770,19 @@
         <w:ind w:left="6480" w:hanging="360"/>
       </w:pPr>
       <w:rPr>
-        <w:rFonts w:ascii="Wingdings" w:hAnsi="Wingdings" w:hint="default"/>
+        <w:rFonts w:hint="default" w:ascii="Wingdings" w:hAnsi="Wingdings"/>
       </w:rPr>
     </w:lvl>
   </w:abstractNum>
+  <w:num w:numId="8">
+    <w:abstractNumId w:val="7"/>
+  </w:num>
+  <w:num w:numId="7">
+    <w:abstractNumId w:val="6"/>
+  </w:num>
+  <w:num w:numId="6">
+    <w:abstractNumId w:val="5"/>
+  </w:num>
   <w:num w:numId="1" w16cid:durableId="1233084362">
     <w:abstractNumId w:val="1"/>
   </w:num>
@@ -902,7 +1806,7 @@
   <w:docDefaults>
     <w:rPrDefault>
       <w:rPr>
-        <w:rFonts w:asciiTheme="minorHAnsi" w:eastAsiaTheme="minorHAnsi" w:hAnsiTheme="minorHAnsi" w:cstheme="minorBidi"/>
+        <w:rFonts w:asciiTheme="minorHAnsi" w:hAnsiTheme="minorHAnsi" w:eastAsiaTheme="minorHAnsi" w:cstheme="minorBidi"/>
         <w:sz w:val="22"/>
         <w:szCs w:val="22"/>
         <w:lang w:val="en-US" w:eastAsia="en-US" w:bidi="ar-SA"/>
@@ -917,14 +1821,14 @@
   <w:latentStyles w:defLockedState="0" w:defUIPriority="99" w:defSemiHidden="0" w:defUnhideWhenUsed="0" w:defQFormat="0" w:count="376">
     <w:lsdException w:name="Normal" w:uiPriority="0" w:qFormat="1"/>
     <w:lsdException w:name="heading 1" w:uiPriority="9" w:qFormat="1"/>
-    <w:lsdException w:name="heading 2" w:semiHidden="1" w:uiPriority="9" w:unhideWhenUsed="1" w:qFormat="1"/>
-    <w:lsdException w:name="heading 3" w:semiHidden="1" w:uiPriority="9" w:unhideWhenUsed="1" w:qFormat="1"/>
-    <w:lsdException w:name="heading 4" w:semiHidden="1" w:uiPriority="9" w:unhideWhenUsed="1" w:qFormat="1"/>
-    <w:lsdException w:name="heading 5" w:semiHidden="1" w:uiPriority="9" w:unhideWhenUsed="1" w:qFormat="1"/>
-    <w:lsdException w:name="heading 6" w:semiHidden="1" w:uiPriority="9" w:unhideWhenUsed="1" w:qFormat="1"/>
-    <w:lsdException w:name="heading 7" w:semiHidden="1" w:uiPriority="9" w:unhideWhenUsed="1" w:qFormat="1"/>
-    <w:lsdException w:name="heading 8" w:semiHidden="1" w:uiPriority="9" w:unhideWhenUsed="1" w:qFormat="1"/>
-    <w:lsdException w:name="heading 9" w:semiHidden="1" w:uiPriority="9" w:unhideWhenUsed="1" w:qFormat="1"/>
+    <w:lsdException w:name="heading 2" w:uiPriority="9" w:semiHidden="1" w:unhideWhenUsed="1" w:qFormat="1"/>
+    <w:lsdException w:name="heading 3" w:uiPriority="9" w:semiHidden="1" w:unhideWhenUsed="1" w:qFormat="1"/>
+    <w:lsdException w:name="heading 4" w:uiPriority="9" w:semiHidden="1" w:unhideWhenUsed="1" w:qFormat="1"/>
+    <w:lsdException w:name="heading 5" w:uiPriority="9" w:semiHidden="1" w:unhideWhenUsed="1" w:qFormat="1"/>
+    <w:lsdException w:name="heading 6" w:uiPriority="9" w:semiHidden="1" w:unhideWhenUsed="1" w:qFormat="1"/>
+    <w:lsdException w:name="heading 7" w:uiPriority="9" w:semiHidden="1" w:unhideWhenUsed="1" w:qFormat="1"/>
+    <w:lsdException w:name="heading 8" w:uiPriority="9" w:semiHidden="1" w:unhideWhenUsed="1" w:qFormat="1"/>
+    <w:lsdException w:name="heading 9" w:uiPriority="9" w:semiHidden="1" w:unhideWhenUsed="1" w:qFormat="1"/>
     <w:lsdException w:name="index 1" w:semiHidden="1" w:unhideWhenUsed="1"/>
     <w:lsdException w:name="index 2" w:semiHidden="1" w:unhideWhenUsed="1"/>
     <w:lsdException w:name="index 3" w:semiHidden="1" w:unhideWhenUsed="1"/>
@@ -934,22 +1838,22 @@
     <w:lsdException w:name="index 7" w:semiHidden="1" w:unhideWhenUsed="1"/>
     <w:lsdException w:name="index 8" w:semiHidden="1" w:unhideWhenUsed="1"/>
     <w:lsdException w:name="index 9" w:semiHidden="1" w:unhideWhenUsed="1"/>
-    <w:lsdException w:name="toc 1" w:semiHidden="1" w:uiPriority="39" w:unhideWhenUsed="1"/>
-    <w:lsdException w:name="toc 2" w:semiHidden="1" w:uiPriority="39" w:unhideWhenUsed="1"/>
-    <w:lsdException w:name="toc 3" w:semiHidden="1" w:uiPriority="39" w:unhideWhenUsed="1"/>
-    <w:lsdException w:name="toc 4" w:semiHidden="1" w:uiPriority="39" w:unhideWhenUsed="1"/>
-    <w:lsdException w:name="toc 5" w:semiHidden="1" w:uiPriority="39" w:unhideWhenUsed="1"/>
-    <w:lsdException w:name="toc 6" w:semiHidden="1" w:uiPriority="39" w:unhideWhenUsed="1"/>
-    <w:lsdException w:name="toc 7" w:semiHidden="1" w:uiPriority="39" w:unhideWhenUsed="1"/>
-    <w:lsdException w:name="toc 8" w:semiHidden="1" w:uiPriority="39" w:unhideWhenUsed="1"/>
-    <w:lsdException w:name="toc 9" w:semiHidden="1" w:uiPriority="39" w:unhideWhenUsed="1"/>
+    <w:lsdException w:name="toc 1" w:uiPriority="39" w:semiHidden="1" w:unhideWhenUsed="1"/>
+    <w:lsdException w:name="toc 2" w:uiPriority="39" w:semiHidden="1" w:unhideWhenUsed="1"/>
+    <w:lsdException w:name="toc 3" w:uiPriority="39" w:semiHidden="1" w:unhideWhenUsed="1"/>
+    <w:lsdException w:name="toc 4" w:uiPriority="39" w:semiHidden="1" w:unhideWhenUsed="1"/>
+    <w:lsdException w:name="toc 5" w:uiPriority="39" w:semiHidden="1" w:unhideWhenUsed="1"/>
+    <w:lsdException w:name="toc 6" w:uiPriority="39" w:semiHidden="1" w:unhideWhenUsed="1"/>
+    <w:lsdException w:name="toc 7" w:uiPriority="39" w:semiHidden="1" w:unhideWhenUsed="1"/>
+    <w:lsdException w:name="toc 8" w:uiPriority="39" w:semiHidden="1" w:unhideWhenUsed="1"/>
+    <w:lsdException w:name="toc 9" w:uiPriority="39" w:semiHidden="1" w:unhideWhenUsed="1"/>
     <w:lsdException w:name="Normal Indent" w:semiHidden="1" w:unhideWhenUsed="1"/>
     <w:lsdException w:name="footnote text" w:semiHidden="1" w:unhideWhenUsed="1"/>
     <w:lsdException w:name="annotation text" w:semiHidden="1" w:unhideWhenUsed="1"/>
     <w:lsdException w:name="header" w:semiHidden="1" w:unhideWhenUsed="1"/>
     <w:lsdException w:name="footer" w:semiHidden="1" w:unhideWhenUsed="1"/>
     <w:lsdException w:name="index heading" w:semiHidden="1" w:unhideWhenUsed="1"/>
-    <w:lsdException w:name="caption" w:semiHidden="1" w:uiPriority="35" w:unhideWhenUsed="1" w:qFormat="1"/>
+    <w:lsdException w:name="caption" w:uiPriority="35" w:semiHidden="1" w:unhideWhenUsed="1" w:qFormat="1"/>
     <w:lsdException w:name="table of figures" w:semiHidden="1" w:unhideWhenUsed="1"/>
     <w:lsdException w:name="envelope address" w:semiHidden="1" w:unhideWhenUsed="1"/>
     <w:lsdException w:name="envelope return" w:semiHidden="1" w:unhideWhenUsed="1"/>
@@ -980,7 +1884,7 @@
     <w:lsdException w:name="Title" w:uiPriority="10" w:qFormat="1"/>
     <w:lsdException w:name="Closing" w:semiHidden="1" w:unhideWhenUsed="1"/>
     <w:lsdException w:name="Signature" w:semiHidden="1" w:unhideWhenUsed="1"/>
-    <w:lsdException w:name="Default Paragraph Font" w:semiHidden="1" w:uiPriority="1" w:unhideWhenUsed="1"/>
+    <w:lsdException w:name="Default Paragraph Font" w:uiPriority="1" w:semiHidden="1" w:unhideWhenUsed="1"/>
     <w:lsdException w:name="Body Text" w:semiHidden="1" w:unhideWhenUsed="1"/>
     <w:lsdException w:name="Body Text Indent" w:semiHidden="1" w:unhideWhenUsed="1"/>
     <w:lsdException w:name="List Continue" w:semiHidden="1" w:unhideWhenUsed="1"/>
@@ -1180,8 +2084,8 @@
     <w:lsdException w:name="Subtle Reference" w:uiPriority="31" w:qFormat="1"/>
     <w:lsdException w:name="Intense Reference" w:uiPriority="32" w:qFormat="1"/>
     <w:lsdException w:name="Book Title" w:uiPriority="33" w:qFormat="1"/>
-    <w:lsdException w:name="Bibliography" w:semiHidden="1" w:uiPriority="37" w:unhideWhenUsed="1"/>
-    <w:lsdException w:name="TOC Heading" w:semiHidden="1" w:uiPriority="39" w:unhideWhenUsed="1" w:qFormat="1"/>
+    <w:lsdException w:name="Bibliography" w:uiPriority="37" w:semiHidden="1" w:unhideWhenUsed="1"/>
+    <w:lsdException w:name="TOC Heading" w:uiPriority="39" w:semiHidden="1" w:unhideWhenUsed="1" w:qFormat="1"/>
     <w:lsdException w:name="Plain Table 1" w:uiPriority="41"/>
     <w:lsdException w:name="Plain Table 2" w:uiPriority="42"/>
     <w:lsdException w:name="Plain Table 3" w:uiPriority="43"/>
@@ -1292,17 +2196,17 @@
     <w:lsdException w:name="Unresolved Mention" w:semiHidden="1" w:unhideWhenUsed="1"/>
     <w:lsdException w:name="Smart Link" w:semiHidden="1" w:unhideWhenUsed="1"/>
   </w:latentStyles>
-  <w:style w:type="paragraph" w:default="1" w:styleId="Normal">
+  <w:style w:type="paragraph" w:styleId="Normal" w:default="1">
     <w:name w:val="Normal"/>
     <w:qFormat/>
   </w:style>
-  <w:style w:type="character" w:default="1" w:styleId="DefaultParagraphFont">
+  <w:style w:type="character" w:styleId="DefaultParagraphFont" w:default="1">
     <w:name w:val="Default Paragraph Font"/>
     <w:uiPriority w:val="1"/>
     <w:semiHidden/>
     <w:unhideWhenUsed/>
   </w:style>
-  <w:style w:type="table" w:default="1" w:styleId="TableNormal">
+  <w:style w:type="table" w:styleId="TableNormal" w:default="1">
     <w:name w:val="Normal Table"/>
     <w:uiPriority w:val="99"/>
     <w:semiHidden/>
@@ -1317,7 +2221,7 @@
       </w:tblCellMar>
     </w:tblPr>
   </w:style>
-  <w:style w:type="numbering" w:default="1" w:styleId="NoList">
+  <w:style w:type="numbering" w:styleId="NoList" w:default="1">
     <w:name w:val="No List"/>
     <w:uiPriority w:val="99"/>
     <w:semiHidden/>
@@ -1332,6 +2236,72 @@
     <w:pPr>
       <w:ind w:left="720"/>
       <w:contextualSpacing/>
+    </w:pPr>
+  </w:style>
+  <w:style xmlns:w="http://schemas.openxmlformats.org/wordprocessingml/2006/main" w:type="table" w:styleId="TableGrid">
+    <w:name xmlns:w="http://schemas.openxmlformats.org/wordprocessingml/2006/main" w:val="Table Grid"/>
+    <w:basedOn xmlns:w="http://schemas.openxmlformats.org/wordprocessingml/2006/main" w:val="TableNormal"/>
+    <w:uiPriority xmlns:w="http://schemas.openxmlformats.org/wordprocessingml/2006/main" w:val="59"/>
+    <w:rsid xmlns:w="http://schemas.openxmlformats.org/wordprocessingml/2006/main" w:val="00FB4123"/>
+    <w:pPr xmlns:w="http://schemas.openxmlformats.org/wordprocessingml/2006/main">
+      <w:spacing w:after="0" w:line="240" w:lineRule="auto"/>
+    </w:pPr>
+    <w:tblPr xmlns:w="http://schemas.openxmlformats.org/wordprocessingml/2006/main">
+      <w:tblInd w:w="0" w:type="dxa"/>
+      <w:tblBorders>
+        <w:top w:val="single" w:color="000000" w:themeColor="text1" w:sz="4" w:space="0"/>
+        <w:left w:val="single" w:color="000000" w:themeColor="text1" w:sz="4" w:space="0"/>
+        <w:bottom w:val="single" w:color="000000" w:themeColor="text1" w:sz="4" w:space="0"/>
+        <w:right w:val="single" w:color="000000" w:themeColor="text1" w:sz="4" w:space="0"/>
+        <w:insideH w:val="single" w:color="000000" w:themeColor="text1" w:sz="4" w:space="0"/>
+        <w:insideV w:val="single" w:color="000000" w:themeColor="text1" w:sz="4" w:space="0"/>
+      </w:tblBorders>
+      <w:tblCellMar>
+        <w:top w:w="0" w:type="dxa"/>
+        <w:left w:w="108" w:type="dxa"/>
+        <w:bottom w:w="0" w:type="dxa"/>
+        <w:right w:w="108" w:type="dxa"/>
+      </w:tblCellMar>
+    </w:tblPr>
+  </w:style>
+  <w:style xmlns:w14="http://schemas.microsoft.com/office/word/2010/wordml" xmlns:mc="http://schemas.openxmlformats.org/markup-compatibility/2006" xmlns:w="http://schemas.openxmlformats.org/wordprocessingml/2006/main" w:type="character" w:styleId="HeaderChar" w:customStyle="1" mc:Ignorable="w14">
+    <w:name xmlns:w="http://schemas.openxmlformats.org/wordprocessingml/2006/main" w:val="Header Char"/>
+    <w:basedOn xmlns:w="http://schemas.openxmlformats.org/wordprocessingml/2006/main" w:val="DefaultParagraphFont"/>
+    <w:link xmlns:w="http://schemas.openxmlformats.org/wordprocessingml/2006/main" w:val="Header"/>
+    <w:uiPriority xmlns:w="http://schemas.openxmlformats.org/wordprocessingml/2006/main" w:val="99"/>
+  </w:style>
+  <w:style xmlns:w14="http://schemas.microsoft.com/office/word/2010/wordml" xmlns:mc="http://schemas.openxmlformats.org/markup-compatibility/2006" xmlns:w="http://schemas.openxmlformats.org/wordprocessingml/2006/main" w:type="paragraph" w:styleId="Header" mc:Ignorable="w14">
+    <w:name xmlns:w="http://schemas.openxmlformats.org/wordprocessingml/2006/main" w:val="header"/>
+    <w:basedOn xmlns:w="http://schemas.openxmlformats.org/wordprocessingml/2006/main" w:val="Normal"/>
+    <w:link xmlns:w="http://schemas.openxmlformats.org/wordprocessingml/2006/main" w:val="HeaderChar"/>
+    <w:uiPriority xmlns:w="http://schemas.openxmlformats.org/wordprocessingml/2006/main" w:val="99"/>
+    <w:unhideWhenUsed xmlns:w="http://schemas.openxmlformats.org/wordprocessingml/2006/main"/>
+    <w:pPr xmlns:w="http://schemas.openxmlformats.org/wordprocessingml/2006/main">
+      <w:tabs xmlns:w="http://schemas.openxmlformats.org/wordprocessingml/2006/main">
+        <w:tab w:val="center" w:pos="4680"/>
+        <w:tab w:val="right" w:pos="9360"/>
+      </w:tabs>
+      <w:spacing xmlns:w="http://schemas.openxmlformats.org/wordprocessingml/2006/main" w:after="0" w:line="240" w:lineRule="auto"/>
+    </w:pPr>
+  </w:style>
+  <w:style xmlns:w14="http://schemas.microsoft.com/office/word/2010/wordml" xmlns:mc="http://schemas.openxmlformats.org/markup-compatibility/2006" xmlns:w="http://schemas.openxmlformats.org/wordprocessingml/2006/main" w:type="character" w:styleId="FooterChar" w:customStyle="1" mc:Ignorable="w14">
+    <w:name xmlns:w="http://schemas.openxmlformats.org/wordprocessingml/2006/main" w:val="Footer Char"/>
+    <w:basedOn xmlns:w="http://schemas.openxmlformats.org/wordprocessingml/2006/main" w:val="DefaultParagraphFont"/>
+    <w:link xmlns:w="http://schemas.openxmlformats.org/wordprocessingml/2006/main" w:val="Footer"/>
+    <w:uiPriority xmlns:w="http://schemas.openxmlformats.org/wordprocessingml/2006/main" w:val="99"/>
+  </w:style>
+  <w:style xmlns:w14="http://schemas.microsoft.com/office/word/2010/wordml" xmlns:mc="http://schemas.openxmlformats.org/markup-compatibility/2006" xmlns:w="http://schemas.openxmlformats.org/wordprocessingml/2006/main" w:type="paragraph" w:styleId="Footer" mc:Ignorable="w14">
+    <w:name xmlns:w="http://schemas.openxmlformats.org/wordprocessingml/2006/main" w:val="footer"/>
+    <w:basedOn xmlns:w="http://schemas.openxmlformats.org/wordprocessingml/2006/main" w:val="Normal"/>
+    <w:link xmlns:w="http://schemas.openxmlformats.org/wordprocessingml/2006/main" w:val="FooterChar"/>
+    <w:uiPriority xmlns:w="http://schemas.openxmlformats.org/wordprocessingml/2006/main" w:val="99"/>
+    <w:unhideWhenUsed xmlns:w="http://schemas.openxmlformats.org/wordprocessingml/2006/main"/>
+    <w:pPr xmlns:w="http://schemas.openxmlformats.org/wordprocessingml/2006/main">
+      <w:tabs xmlns:w="http://schemas.openxmlformats.org/wordprocessingml/2006/main">
+        <w:tab w:val="center" w:pos="4680"/>
+        <w:tab w:val="right" w:pos="9360"/>
+      </w:tabs>
+      <w:spacing xmlns:w="http://schemas.openxmlformats.org/wordprocessingml/2006/main" w:after="0" w:line="240" w:lineRule="auto"/>
     </w:pPr>
   </w:style>
 </w:styles>

</xml_diff>